<commit_message>
:books: docs: Documentação atualizada TechnicalResponsibility
</commit_message>
<xml_diff>
--- a/Documents/Documents/Sprint08_Task100_API_TechnicalResponsibility.docx
+++ b/Documents/Documents/Sprint08_Task100_API_TechnicalResponsibility.docx
@@ -57,7 +57,7 @@
               </wp:inline>
             </w:drawing>
           </mc:Choice>
-          <mc:Fallback xmlns:w16sdtdh="http://schemas.microsoft.com/office/word/2020/wordml/sdtdatahash" xmlns:w16="http://schemas.microsoft.com/office/word/2018/wordml" xmlns:w16cex="http://schemas.microsoft.com/office/word/2018/wordml/cex" xmlns:a="http://schemas.openxmlformats.org/drawingml/2006/main">
+          <mc:Fallback xmlns:a="http://schemas.openxmlformats.org/drawingml/2006/main" xmlns:w16cex="http://schemas.microsoft.com/office/word/2018/wordml/cex" xmlns:w16="http://schemas.microsoft.com/office/word/2018/wordml" xmlns:w16sdtdh="http://schemas.microsoft.com/office/word/2020/wordml/sdtdatahash">
             <w:pict>
               <v:shapetype id="_x0000_t75" coordsize="21600,21600" o:spt="75" o:preferrelative="t" path="m@4@5l@4@11@9@11@9@5xe" filled="f" stroked="f">
                 <v:stroke joinstyle="miter"/>
@@ -256,21 +256,12 @@
               </w:rPr>
               <w:t>1</w:t>
             </w:r>
-            <w:bookmarkStart w:id="0" w:name="_GoBack"/>
-            <w:bookmarkEnd w:id="0"/>
             <w:r>
               <w:rPr>
                 <w:rFonts w:ascii="Open Sans" w:eastAsia="Open Sans" w:hAnsi="Open Sans" w:cs="Open Sans"/>
                 <w:b/>
               </w:rPr>
-              <w:t>0</w:t>
-            </w:r>
-            <w:r>
-              <w:rPr>
-                <w:rFonts w:ascii="Open Sans" w:eastAsia="Open Sans" w:hAnsi="Open Sans" w:cs="Open Sans"/>
-                <w:b/>
-              </w:rPr>
-              <w:t>/10/2025</w:t>
+              <w:t>0/10/2025</w:t>
             </w:r>
           </w:p>
         </w:tc>
@@ -1706,7 +1697,6 @@
       </w:r>
       <w:r>
         <w:rPr>
-          <w:rStyle w:val="TableGridLight"/>
           <w:rFonts w:ascii="Open Sans" w:eastAsiaTheme="majorEastAsia" w:hAnsi="Open Sans" w:cs="Open Sans"/>
         </w:rPr>
         <w:t xml:space="preserve"> </w:t>
@@ -1795,7 +1785,6 @@
       </w:r>
       <w:r>
         <w:rPr>
-          <w:rStyle w:val="TableGridLight"/>
           <w:rFonts w:ascii="Open Sans" w:eastAsiaTheme="majorEastAsia" w:hAnsi="Open Sans" w:cs="Open Sans"/>
         </w:rPr>
         <w:t xml:space="preserve"> </w:t>
@@ -1837,13 +1826,7 @@
         <w:rPr>
           <w:rFonts w:ascii="Open Sans" w:eastAsia="Open Sans" w:hAnsi="Open Sans" w:cs="Open Sans"/>
         </w:rPr>
-        <w:t xml:space="preserve"> </w:t>
-      </w:r>
-      <w:r>
-        <w:rPr>
-          <w:rFonts w:ascii="Open Sans" w:eastAsia="Open Sans" w:hAnsi="Open Sans" w:cs="Open Sans"/>
-        </w:rPr>
-        <w:t>Responsabilidade Técnica</w:t>
+        <w:t xml:space="preserve"> Responsabilidade Técnica</w:t>
       </w:r>
       <w:r>
         <w:rPr>
@@ -1888,7 +1871,6 @@
       </w:r>
       <w:r>
         <w:rPr>
-          <w:rStyle w:val="TableGridLight"/>
           <w:rFonts w:ascii="Open Sans" w:eastAsiaTheme="majorEastAsia" w:hAnsi="Open Sans" w:cs="Open Sans"/>
         </w:rPr>
         <w:t xml:space="preserve"> </w:t>
@@ -1920,13 +1902,7 @@
         <w:rPr>
           <w:rFonts w:ascii="Open Sans" w:eastAsia="Open Sans" w:hAnsi="Open Sans" w:cs="Open Sans"/>
         </w:rPr>
-        <w:t xml:space="preserve">: Atualiza os </w:t>
-      </w:r>
-      <w:r>
-        <w:rPr>
-          <w:rFonts w:ascii="Open Sans" w:eastAsia="Open Sans" w:hAnsi="Open Sans" w:cs="Open Sans"/>
-        </w:rPr>
-        <w:t>dados de um</w:t>
+        <w:t>: Atualiza os dados de um</w:t>
       </w:r>
       <w:r>
         <w:rPr>
@@ -2539,7 +2515,20 @@
           <w:lang w:eastAsia="pt-BR"/>
           <w14:ligatures w14:val="none"/>
         </w:rPr>
-        <w:t xml:space="preserve"> (um</w:t>
+        <w:t xml:space="preserve"> (uma </w:t>
+      </w:r>
+      <w:r>
+        <w:rPr>
+          <w:rFonts w:ascii="Open Sans" w:eastAsia="Open Sans" w:hAnsi="Open Sans" w:cs="Open Sans"/>
+          <w:sz w:val="24"/>
+        </w:rPr>
+        <w:t xml:space="preserve">Responsabilidade Técnica </w:t>
+      </w:r>
+      <w:r>
+        <w:rPr>
+          <w:rFonts w:ascii="Open Sans" w:eastAsia="Open Sans" w:hAnsi="Open Sans" w:cs="Open Sans"/>
+        </w:rPr>
+        <w:t>t</w:t>
       </w:r>
       <w:r>
         <w:rPr>
@@ -2549,21 +2538,9 @@
           <w:lang w:eastAsia="pt-BR"/>
           <w14:ligatures w14:val="none"/>
         </w:rPr>
-        <w:t xml:space="preserve">a </w:t>
+        <w:t xml:space="preserve">em um </w:t>
       </w:r>
-      <w:r>
-        <w:rPr>
-          <w:rFonts w:ascii="Open Sans" w:eastAsia="Open Sans" w:hAnsi="Open Sans" w:cs="Open Sans"/>
-          <w:sz w:val="24"/>
-        </w:rPr>
-        <w:t xml:space="preserve">Responsabilidade Técnica </w:t>
-      </w:r>
-      <w:r>
-        <w:rPr>
-          <w:rFonts w:ascii="Open Sans" w:eastAsia="Open Sans" w:hAnsi="Open Sans" w:cs="Open Sans"/>
-        </w:rPr>
-        <w:t>t</w:t>
-      </w:r>
+      <w:proofErr w:type="spellStart"/>
       <w:r>
         <w:rPr>
           <w:rFonts w:ascii="Open Sans" w:eastAsia="Open Sans" w:hAnsi="Open Sans" w:cs="Open Sans"/>
@@ -2572,8 +2549,9 @@
           <w:lang w:eastAsia="pt-BR"/>
           <w14:ligatures w14:val="none"/>
         </w:rPr>
-        <w:t>em um</w:t>
+        <w:t>funcionario</w:t>
       </w:r>
+      <w:proofErr w:type="spellEnd"/>
       <w:r>
         <w:rPr>
           <w:rFonts w:ascii="Open Sans" w:eastAsia="Open Sans" w:hAnsi="Open Sans" w:cs="Open Sans"/>
@@ -2582,28 +2560,6 @@
           <w:lang w:eastAsia="pt-BR"/>
           <w14:ligatures w14:val="none"/>
         </w:rPr>
-        <w:t xml:space="preserve"> </w:t>
-      </w:r>
-      <w:proofErr w:type="spellStart"/>
-      <w:r>
-        <w:rPr>
-          <w:rFonts w:ascii="Open Sans" w:eastAsia="Open Sans" w:hAnsi="Open Sans" w:cs="Open Sans"/>
-          <w:sz w:val="24"/>
-          <w:szCs w:val="24"/>
-          <w:lang w:eastAsia="pt-BR"/>
-          <w14:ligatures w14:val="none"/>
-        </w:rPr>
-        <w:t>funcionario</w:t>
-      </w:r>
-      <w:proofErr w:type="spellEnd"/>
-      <w:r>
-        <w:rPr>
-          <w:rFonts w:ascii="Open Sans" w:eastAsia="Open Sans" w:hAnsi="Open Sans" w:cs="Open Sans"/>
-          <w:sz w:val="24"/>
-          <w:szCs w:val="24"/>
-          <w:lang w:eastAsia="pt-BR"/>
-          <w14:ligatures w14:val="none"/>
-        </w:rPr>
         <w:t>).</w:t>
       </w:r>
       <w:r>
@@ -2620,6 +2576,48 @@
           <w:rFonts w:ascii="Open Sans" w:hAnsi="Open Sans" w:cs="Open Sans"/>
         </w:rPr>
       </w:pPr>
+      <w:r>
+        <w:rPr>
+          <w:rFonts w:ascii="Open Sans" w:hAnsi="Open Sans" w:cs="Open Sans"/>
+        </w:rPr>
+        <w:drawing>
+          <wp:inline distT="0" distB="0" distL="0" distR="0" wp14:anchorId="19E7192F" wp14:editId="031B61D2">
+            <wp:extent cx="6472555" cy="5614035"/>
+            <wp:effectExtent l="0" t="0" r="4445" b="5715"/>
+            <wp:docPr id="2" name="Imagem 2"/>
+            <wp:cNvGraphicFramePr>
+              <a:graphicFrameLocks xmlns:a="http://schemas.openxmlformats.org/drawingml/2006/main" noChangeAspect="1"/>
+            </wp:cNvGraphicFramePr>
+            <a:graphic xmlns:a="http://schemas.openxmlformats.org/drawingml/2006/main">
+              <a:graphicData uri="http://schemas.openxmlformats.org/drawingml/2006/picture">
+                <pic:pic xmlns:pic="http://schemas.openxmlformats.org/drawingml/2006/picture">
+                  <pic:nvPicPr>
+                    <pic:cNvPr id="1" name=""/>
+                    <pic:cNvPicPr/>
+                  </pic:nvPicPr>
+                  <pic:blipFill>
+                    <a:blip r:embed="rId13"/>
+                    <a:stretch>
+                      <a:fillRect/>
+                    </a:stretch>
+                  </pic:blipFill>
+                  <pic:spPr>
+                    <a:xfrm>
+                      <a:off x="0" y="0"/>
+                      <a:ext cx="6472555" cy="5614035"/>
+                    </a:xfrm>
+                    <a:prstGeom prst="rect">
+                      <a:avLst/>
+                    </a:prstGeom>
+                  </pic:spPr>
+                </pic:pic>
+              </a:graphicData>
+            </a:graphic>
+          </wp:inline>
+        </w:drawing>
+      </w:r>
+      <w:bookmarkStart w:id="0" w:name="_GoBack"/>
+      <w:bookmarkEnd w:id="0"/>
     </w:p>
     <w:p>
       <w:pPr>
@@ -2669,13 +2667,7 @@
         <w:rPr>
           <w:rFonts w:ascii="Open Sans" w:eastAsia="Open Sans" w:hAnsi="Open Sans" w:cs="Open Sans"/>
         </w:rPr>
-        <w:t xml:space="preserve"> para o desenvolvimento da API trouxe clareza na separação das responsabilidades de cada método (GET, POST, PUT) e fac</w:t>
-      </w:r>
-      <w:r>
-        <w:rPr>
-          <w:rFonts w:ascii="Open Sans" w:eastAsia="Open Sans" w:hAnsi="Open Sans" w:cs="Open Sans"/>
-        </w:rPr>
-        <w:t>ilitou a organização do código.</w:t>
+        <w:t xml:space="preserve"> para o desenvolvimento da API trouxe clareza na separação das responsabilidades de cada método (GET, POST, PUT) e facilitou a organização do código.</w:t>
       </w:r>
     </w:p>
     <w:p>
@@ -2756,19 +2748,14 @@
           <w:rStyle w:val="Forte"/>
           <w:rFonts w:ascii="Open Sans" w:eastAsiaTheme="majorEastAsia" w:hAnsi="Open Sans" w:cs="Open Sans"/>
         </w:rPr>
+        <w:lastRenderedPageBreak/>
         <w:t>Validação de Dados:</w:t>
       </w:r>
       <w:r>
         <w:rPr>
           <w:rFonts w:ascii="Open Sans" w:eastAsia="Open Sans" w:hAnsi="Open Sans" w:cs="Open Sans"/>
         </w:rPr>
-        <w:t xml:space="preserve"> Algumas validações, como a verificação de dados duplic</w:t>
-      </w:r>
-      <w:r>
-        <w:rPr>
-          <w:rFonts w:ascii="Open Sans" w:eastAsia="Open Sans" w:hAnsi="Open Sans" w:cs="Open Sans"/>
-        </w:rPr>
-        <w:t xml:space="preserve">ados (ex.: </w:t>
+        <w:t xml:space="preserve"> Algumas validações, como a verificação de dados duplicados (ex.: </w:t>
       </w:r>
       <w:r>
         <w:rPr>
@@ -2780,13 +2767,7 @@
         <w:rPr>
           <w:rFonts w:ascii="Open Sans" w:eastAsia="Open Sans" w:hAnsi="Open Sans" w:cs="Open Sans"/>
         </w:rPr>
-        <w:t xml:space="preserve">), </w:t>
-      </w:r>
-      <w:r>
-        <w:rPr>
-          <w:rFonts w:ascii="Open Sans" w:eastAsia="Open Sans" w:hAnsi="Open Sans" w:cs="Open Sans"/>
-        </w:rPr>
-        <w:t xml:space="preserve">foram implementadas </w:t>
+        <w:t xml:space="preserve">), foram implementadas </w:t>
       </w:r>
       <w:r>
         <w:rPr>
@@ -3005,7 +2986,6 @@
           <w:sz w:val="24"/>
           <w:szCs w:val="24"/>
         </w:rPr>
-        <w:lastRenderedPageBreak/>
         <w:t xml:space="preserve"> </w:t>
       </w:r>
     </w:p>
@@ -4851,15 +4831,6 @@
   </w:num>
   <w:num w:numId="15">
     <w:abstractNumId w:val="13"/>
-    <w:lvlOverride w:ilvl="0"/>
-    <w:lvlOverride w:ilvl="1"/>
-    <w:lvlOverride w:ilvl="2"/>
-    <w:lvlOverride w:ilvl="3"/>
-    <w:lvlOverride w:ilvl="4"/>
-    <w:lvlOverride w:ilvl="5"/>
-    <w:lvlOverride w:ilvl="6"/>
-    <w:lvlOverride w:ilvl="7"/>
-    <w:lvlOverride w:ilvl="8"/>
   </w:num>
 </w:numbering>
 </file>
@@ -5037,7 +5008,7 @@
     <w:lsdException w:name="Table Web 2" w:semiHidden="1" w:unhideWhenUsed="1"/>
     <w:lsdException w:name="Table Web 3" w:semiHidden="1" w:unhideWhenUsed="1"/>
     <w:lsdException w:name="Balloon Text" w:semiHidden="1" w:unhideWhenUsed="1"/>
-    <w:lsdException w:name="Table Grid" w:semiHidden="1" w:uiPriority="59" w:unhideWhenUsed="1"/>
+    <w:lsdException w:name="Table Grid" w:uiPriority="59"/>
     <w:lsdException w:name="Table Theme" w:semiHidden="1" w:unhideWhenUsed="1"/>
     <w:lsdException w:name="Placeholder Text" w:semiHidden="1"/>
     <w:lsdException w:name="No Spacing" w:uiPriority="1" w:qFormat="1"/>
@@ -17371,9 +17342,12 @@
 </file>
 
 <file path=customXml/item1.xml><?xml version="1.0" encoding="utf-8"?>
-<p:properties xmlns:p="http://schemas.microsoft.com/office/2006/metadata/properties" xmlns:xsi="http://www.w3.org/2001/XMLSchema-instance" xmlns:pc="http://schemas.microsoft.com/office/infopath/2007/PartnerControls">
-  <documentManagement/>
-</p:properties>
+<?mso-contentType ?>
+<FormTemplates xmlns="http://schemas.microsoft.com/sharepoint/v3/contenttype/forms">
+  <Display>DocumentLibraryForm</Display>
+  <Edit>DocumentLibraryForm</Edit>
+  <New>DocumentLibraryForm</New>
+</FormTemplates>
 </file>
 
 <file path=customXml/item2.xml><?xml version="1.0" encoding="utf-8"?>
@@ -17513,19 +17487,15 @@
 </file>
 
 <file path=customXml/item3.xml><?xml version="1.0" encoding="utf-8"?>
-<?mso-contentType ?>
-<FormTemplates xmlns="http://schemas.microsoft.com/sharepoint/v3/contenttype/forms">
-  <Display>DocumentLibraryForm</Display>
-  <Edit>DocumentLibraryForm</Edit>
-  <New>DocumentLibraryForm</New>
-</FormTemplates>
+<p:properties xmlns:p="http://schemas.microsoft.com/office/2006/metadata/properties" xmlns:xsi="http://www.w3.org/2001/XMLSchema-instance" xmlns:pc="http://schemas.microsoft.com/office/infopath/2007/PartnerControls">
+  <documentManagement/>
+</p:properties>
 </file>
 
 <file path=customXml/itemProps1.xml><?xml version="1.0" encoding="utf-8"?>
-<ds:datastoreItem xmlns:ds="http://schemas.openxmlformats.org/officeDocument/2006/customXml" ds:itemID="{0028EFB7-3706-477C-BC22-76AF0C752638}">
+<ds:datastoreItem xmlns:ds="http://schemas.openxmlformats.org/officeDocument/2006/customXml" ds:itemID="{0876BD9A-9CA5-48C2-BF8E-F2DECFB0FD38}">
   <ds:schemaRefs>
-    <ds:schemaRef ds:uri="http://schemas.microsoft.com/office/2006/metadata/properties"/>
-    <ds:schemaRef ds:uri="http://schemas.microsoft.com/office/infopath/2007/PartnerControls"/>
+    <ds:schemaRef ds:uri="http://schemas.microsoft.com/sharepoint/v3/contenttype/forms"/>
   </ds:schemaRefs>
 </ds:datastoreItem>
 </file>
@@ -17549,9 +17519,10 @@
 </file>
 
 <file path=customXml/itemProps3.xml><?xml version="1.0" encoding="utf-8"?>
-<ds:datastoreItem xmlns:ds="http://schemas.openxmlformats.org/officeDocument/2006/customXml" ds:itemID="{0876BD9A-9CA5-48C2-BF8E-F2DECFB0FD38}">
+<ds:datastoreItem xmlns:ds="http://schemas.openxmlformats.org/officeDocument/2006/customXml" ds:itemID="{0028EFB7-3706-477C-BC22-76AF0C752638}">
   <ds:schemaRefs>
-    <ds:schemaRef ds:uri="http://schemas.microsoft.com/sharepoint/v3/contenttype/forms"/>
+    <ds:schemaRef ds:uri="http://schemas.microsoft.com/office/2006/metadata/properties"/>
+    <ds:schemaRef ds:uri="http://schemas.microsoft.com/office/infopath/2007/PartnerControls"/>
   </ds:schemaRefs>
 </ds:datastoreItem>
 </file>
</xml_diff>